<commit_message>
Some more theory updates
Nothing other than that, yet.
</commit_message>
<xml_diff>
--- a/docs/теория.docx
+++ b/docs/теория.docx
@@ -6,21 +6,70 @@
       <w:pPr>
         <w:jc w:val="center"/>
         <w:rPr>
-          <w:lang w:val="ru-RU"/>
-        </w:rPr>
-      </w:pPr>
-      <w:r>
-        <w:rPr>
-          <w:lang w:val="ru-RU"/>
-        </w:rPr>
-        <w:t>КУРСОВАЯ РАБОТА</w:t>
+          <w:sz w:val="24"/>
+          <w:szCs w:val="28"/>
+        </w:rPr>
+      </w:pPr>
+      <w:r>
+        <w:rPr>
+          <w:noProof/>
+          <w:szCs w:val="28"/>
+        </w:rPr>
+        <w:drawing>
+          <wp:inline distT="0" distB="0" distL="0" distR="0" wp14:anchorId="7AB89220" wp14:editId="14BDDCCA">
+            <wp:extent cx="5486400" cy="762635"/>
+            <wp:effectExtent l="0" t="0" r="0" b="0"/>
+            <wp:docPr id="1" name="Picture 1"/>
+            <wp:cNvGraphicFramePr>
+              <a:graphicFrameLocks xmlns:a="http://schemas.openxmlformats.org/drawingml/2006/main" noChangeAspect="1"/>
+            </wp:cNvGraphicFramePr>
+            <a:graphic xmlns:a="http://schemas.openxmlformats.org/drawingml/2006/main">
+              <a:graphicData uri="http://schemas.openxmlformats.org/drawingml/2006/picture">
+                <pic:pic xmlns:pic="http://schemas.openxmlformats.org/drawingml/2006/picture">
+                  <pic:nvPicPr>
+                    <pic:cNvPr id="0" name="Рисунок 2"/>
+                    <pic:cNvPicPr>
+                      <a:picLocks noChangeAspect="1" noChangeArrowheads="1"/>
+                    </pic:cNvPicPr>
+                  </pic:nvPicPr>
+                  <pic:blipFill>
+                    <a:blip r:embed="rId6">
+                      <a:extLst>
+                        <a:ext uri="{28A0092B-C50C-407E-A947-70E740481C1C}">
+                          <a14:useLocalDpi xmlns:a14="http://schemas.microsoft.com/office/drawing/2010/main" val="0"/>
+                        </a:ext>
+                      </a:extLst>
+                    </a:blip>
+                    <a:srcRect t="10834" b="15833"/>
+                    <a:stretch>
+                      <a:fillRect/>
+                    </a:stretch>
+                  </pic:blipFill>
+                  <pic:spPr bwMode="auto">
+                    <a:xfrm>
+                      <a:off x="0" y="0"/>
+                      <a:ext cx="5486400" cy="762635"/>
+                    </a:xfrm>
+                    <a:prstGeom prst="rect">
+                      <a:avLst/>
+                    </a:prstGeom>
+                    <a:noFill/>
+                    <a:ln>
+                      <a:noFill/>
+                    </a:ln>
+                  </pic:spPr>
+                </pic:pic>
+              </a:graphicData>
+            </a:graphic>
+          </wp:inline>
+        </w:drawing>
       </w:r>
     </w:p>
     <w:p>
       <w:pPr>
         <w:jc w:val="center"/>
         <w:rPr>
-          <w:lang w:val="ru-RU"/>
+          <w:szCs w:val="28"/>
         </w:rPr>
       </w:pPr>
     </w:p>
@@ -28,7 +77,7 @@
       <w:pPr>
         <w:jc w:val="center"/>
         <w:rPr>
-          <w:lang w:val="ru-RU"/>
+          <w:szCs w:val="28"/>
         </w:rPr>
       </w:pPr>
     </w:p>
@@ -36,258 +85,743 @@
       <w:pPr>
         <w:jc w:val="center"/>
         <w:rPr>
-          <w:lang w:val="ru-RU"/>
-        </w:rPr>
-      </w:pPr>
-      <w:r>
-        <w:rPr>
-          <w:lang w:val="ru-RU"/>
-        </w:rPr>
-        <w:t>на тему:</w:t>
+          <w:szCs w:val="28"/>
+          <w:lang w:val="ru-RU"/>
+        </w:rPr>
+      </w:pPr>
+      <w:r>
+        <w:rPr>
+          <w:szCs w:val="28"/>
+          <w:lang w:val="ru-RU"/>
+        </w:rPr>
+        <w:t>Факультет «Информационные технологии»</w:t>
       </w:r>
     </w:p>
     <w:p>
       <w:pPr>
-        <w:rPr>
-          <w:lang w:val="ru-RU"/>
-        </w:rPr>
-      </w:pPr>
+        <w:jc w:val="center"/>
+        <w:rPr>
+          <w:szCs w:val="28"/>
+          <w:lang w:val="ru-RU"/>
+        </w:rPr>
+      </w:pPr>
+      <w:r>
+        <w:rPr>
+          <w:szCs w:val="28"/>
+          <w:lang w:val="ru-RU"/>
+        </w:rPr>
+        <w:t>Кафедра «Прикладная математика»</w:t>
+      </w:r>
     </w:p>
     <w:p>
       <w:pPr>
-        <w:jc w:val="center"/>
-        <w:rPr>
-          <w:b/>
-          <w:lang w:val="ru-RU"/>
-        </w:rPr>
-      </w:pPr>
-      <w:r>
-        <w:rPr>
-          <w:b/>
-          <w:lang w:val="ru-RU"/>
-        </w:rPr>
-        <w:t xml:space="preserve"> «</w:t>
-      </w:r>
-      <w:r>
-        <w:rPr>
-          <w:b/>
-          <w:lang w:val="ru-RU"/>
-        </w:rPr>
-        <w:t>Разработка движка для работы с графовыми базами данных</w:t>
-      </w:r>
-      <w:r>
-        <w:rPr>
-          <w:b/>
-          <w:lang w:val="ru-RU"/>
-        </w:rPr>
-        <w:t>»</w:t>
-      </w:r>
+        <w:rPr>
+          <w:sz w:val="16"/>
+          <w:szCs w:val="16"/>
+          <w:lang w:val="ru-RU"/>
+        </w:rPr>
+      </w:pPr>
     </w:p>
     <w:p>
       <w:pPr>
+        <w:jc w:val="center"/>
         <w:rPr>
           <w:b/>
+          <w:sz w:val="32"/>
+          <w:szCs w:val="24"/>
           <w:lang w:val="ru-RU"/>
         </w:rPr>
       </w:pPr>
     </w:p>
     <w:p>
       <w:pPr>
-        <w:rPr>
+        <w:jc w:val="center"/>
+        <w:rPr>
+          <w:b/>
+          <w:sz w:val="24"/>
           <w:lang w:val="ru-RU"/>
         </w:rPr>
       </w:pPr>
     </w:p>
     <w:p>
       <w:pPr>
-        <w:rPr>
-          <w:lang w:val="ru-RU"/>
-        </w:rPr>
-      </w:pPr>
+        <w:pBdr>
+          <w:bottom w:val="single" w:sz="12" w:space="1" w:color="auto"/>
+        </w:pBdr>
+        <w:jc w:val="center"/>
+        <w:rPr>
+          <w:b/>
+          <w:sz w:val="32"/>
+          <w:szCs w:val="32"/>
+          <w:lang w:val="ru-RU"/>
+        </w:rPr>
+      </w:pPr>
+      <w:r>
+        <w:rPr>
+          <w:b/>
+          <w:sz w:val="32"/>
+          <w:szCs w:val="32"/>
+          <w:lang w:val="ru-RU"/>
+        </w:rPr>
+        <w:t>КУРСОВАЯ РАБОТА</w:t>
+      </w:r>
     </w:p>
     <w:p>
       <w:pPr>
-        <w:rPr>
-          <w:lang w:val="ru-RU"/>
-        </w:rPr>
-      </w:pPr>
+        <w:pBdr>
+          <w:bottom w:val="single" w:sz="12" w:space="1" w:color="auto"/>
+        </w:pBdr>
+        <w:jc w:val="center"/>
+        <w:rPr>
+          <w:sz w:val="32"/>
+          <w:szCs w:val="32"/>
+          <w:lang w:val="ru-RU"/>
+        </w:rPr>
+      </w:pPr>
+      <w:r>
+        <w:rPr>
+          <w:sz w:val="32"/>
+          <w:szCs w:val="32"/>
+          <w:lang w:val="ru-RU"/>
+        </w:rPr>
+        <w:t>по дисциплине «Математическое моделирование и анализ данных»</w:t>
+      </w:r>
     </w:p>
     <w:p>
       <w:pPr>
-        <w:rPr>
-          <w:lang w:val="ru-RU"/>
-        </w:rPr>
-      </w:pPr>
+        <w:jc w:val="center"/>
+        <w:rPr>
+          <w:b/>
+          <w:i/>
+          <w:sz w:val="22"/>
+          <w:szCs w:val="32"/>
+          <w:lang w:val="ru-RU"/>
+        </w:rPr>
+      </w:pPr>
+      <w:r>
+        <w:rPr>
+          <w:b/>
+          <w:i/>
+          <w:sz w:val="22"/>
+          <w:szCs w:val="32"/>
+          <w:lang w:val="ru-RU"/>
+        </w:rPr>
+        <w:t>( по дисциплине «…», по модулю «….» или научно-исследовательская работа)</w:t>
+      </w:r>
     </w:p>
     <w:p>
       <w:pPr>
-        <w:rPr>
+        <w:jc w:val="center"/>
+        <w:rPr>
+          <w:b/>
+          <w:sz w:val="32"/>
+          <w:szCs w:val="32"/>
           <w:lang w:val="ru-RU"/>
         </w:rPr>
       </w:pPr>
     </w:p>
     <w:p>
       <w:pPr>
-        <w:rPr>
+        <w:jc w:val="center"/>
+        <w:rPr>
+          <w:sz w:val="32"/>
+          <w:szCs w:val="32"/>
           <w:lang w:val="ru-RU"/>
         </w:rPr>
       </w:pPr>
     </w:p>
     <w:p>
       <w:pPr>
-        <w:jc w:val="right"/>
-        <w:rPr>
-          <w:b/>
-          <w:lang w:val="ru-RU"/>
-        </w:rPr>
-      </w:pPr>
-      <w:r>
-        <w:rPr>
-          <w:b/>
-          <w:lang w:val="ru-RU"/>
-        </w:rPr>
-        <w:t>Выполнил:</w:t>
+        <w:pStyle w:val="Default"/>
+        <w:jc w:val="center"/>
+        <w:rPr>
+          <w:color w:val="auto"/>
+          <w:sz w:val="28"/>
+          <w:szCs w:val="28"/>
+        </w:rPr>
+      </w:pPr>
+      <w:r>
+        <w:rPr>
+          <w:color w:val="auto"/>
+          <w:sz w:val="28"/>
+          <w:szCs w:val="28"/>
+        </w:rPr>
+        <w:t>на тему: «</w:t>
+      </w:r>
+      <w:r>
+        <w:rPr>
+          <w:color w:val="auto"/>
+          <w:sz w:val="28"/>
+          <w:szCs w:val="28"/>
+        </w:rPr>
+        <w:t>Разработка движка для работы с графовыми базами данных</w:t>
+      </w:r>
+      <w:r>
+        <w:rPr>
+          <w:color w:val="auto"/>
+          <w:sz w:val="28"/>
+          <w:szCs w:val="28"/>
+        </w:rPr>
+        <w:t>»</w:t>
       </w:r>
     </w:p>
     <w:p>
       <w:pPr>
-        <w:jc w:val="right"/>
-        <w:rPr>
-          <w:lang w:val="ru-RU"/>
-        </w:rPr>
-      </w:pPr>
-      <w:r>
-        <w:rPr>
-          <w:lang w:val="ru-RU"/>
-        </w:rPr>
-        <w:t>Студент группы 23ИТ-МО</w:t>
-      </w:r>
+        <w:rPr>
+          <w:sz w:val="24"/>
+          <w:szCs w:val="28"/>
+          <w:lang w:val="ru-RU"/>
+        </w:rPr>
+      </w:pPr>
     </w:p>
     <w:p>
       <w:pPr>
-        <w:jc w:val="right"/>
-        <w:rPr>
-          <w:lang w:val="ru-RU"/>
-        </w:rPr>
-      </w:pPr>
-      <w:r>
-        <w:rPr>
-          <w:lang w:val="ru-RU"/>
-        </w:rPr>
-        <w:t>Шигабутдинов Т.А.</w:t>
-      </w:r>
+        <w:rPr>
+          <w:szCs w:val="28"/>
+          <w:lang w:val="ru-RU"/>
+        </w:rPr>
+      </w:pPr>
     </w:p>
     <w:p>
       <w:pPr>
         <w:rPr>
+          <w:szCs w:val="28"/>
           <w:lang w:val="ru-RU"/>
         </w:rPr>
       </w:pPr>
     </w:p>
     <w:p>
       <w:pPr>
-        <w:jc w:val="right"/>
-        <w:rPr>
-          <w:b/>
-          <w:lang w:val="ru-RU"/>
-        </w:rPr>
-      </w:pPr>
-      <w:r>
-        <w:rPr>
-          <w:b/>
-          <w:lang w:val="ru-RU"/>
-        </w:rPr>
-        <w:t>Научный руководитель:</w:t>
+        <w:jc w:val="both"/>
+        <w:rPr>
+          <w:sz w:val="24"/>
+          <w:szCs w:val="28"/>
+          <w:u w:val="single"/>
+          <w:lang w:val="ru-RU"/>
+        </w:rPr>
+      </w:pPr>
+      <w:r>
+        <w:rPr>
+          <w:szCs w:val="28"/>
+          <w:lang w:val="ru-RU"/>
+        </w:rPr>
+        <w:t xml:space="preserve">Направление подготовки </w:t>
+      </w:r>
+      <w:r>
+        <w:rPr>
+          <w:szCs w:val="28"/>
+          <w:u w:val="single"/>
+        </w:rPr>
+        <w:t> </w:t>
+      </w:r>
+      <w:r>
+        <w:rPr>
+          <w:szCs w:val="28"/>
+          <w:u w:val="single"/>
+          <w:lang w:val="ru-RU"/>
+        </w:rPr>
+        <w:t>02.03.03 Математическое обеспечение и администрирование информационных систем</w:t>
+      </w:r>
+      <w:r>
+        <w:rPr>
+          <w:szCs w:val="28"/>
+          <w:u w:val="single"/>
+        </w:rPr>
+        <w:t>                                                           </w:t>
       </w:r>
     </w:p>
     <w:p>
       <w:pPr>
-        <w:jc w:val="right"/>
-        <w:rPr>
-          <w:b/>
-          <w:lang w:val="ru-RU"/>
-        </w:rPr>
-      </w:pPr>
-      <w:r>
-        <w:rPr>
-          <w:b/>
-          <w:lang w:val="ru-RU"/>
-        </w:rPr>
-        <w:t>Колотовкин И.С.</w:t>
+        <w:tabs>
+          <w:tab w:val="left" w:pos="6096"/>
+        </w:tabs>
+        <w:rPr>
+          <w:szCs w:val="24"/>
+          <w:vertAlign w:val="superscript"/>
+          <w:lang w:val="ru-RU"/>
+        </w:rPr>
+      </w:pPr>
+      <w:r>
+        <w:rPr>
+          <w:vertAlign w:val="superscript"/>
+          <w:lang w:val="ru-RU"/>
+        </w:rPr>
+        <w:lastRenderedPageBreak/>
+        <w:t xml:space="preserve">                                                                                                  (код и наименование)</w:t>
       </w:r>
     </w:p>
     <w:p>
       <w:pPr>
         <w:rPr>
-          <w:lang w:val="ru-RU"/>
-        </w:rPr>
-      </w:pPr>
+          <w:szCs w:val="28"/>
+          <w:lang w:val="ru-RU"/>
+        </w:rPr>
+      </w:pPr>
+      <w:r>
+        <w:rPr>
+          <w:szCs w:val="28"/>
+          <w:lang w:val="ru-RU"/>
+        </w:rPr>
+        <w:t xml:space="preserve">Направленность программы </w:t>
+      </w:r>
+      <w:r>
+        <w:rPr>
+          <w:szCs w:val="28"/>
+          <w:u w:val="single"/>
+        </w:rPr>
+        <w:t>  </w:t>
+      </w:r>
+      <w:r>
+        <w:rPr>
+          <w:szCs w:val="28"/>
+          <w:u w:val="single"/>
+          <w:lang w:val="ru-RU"/>
+        </w:rPr>
+        <w:t>Информационные системы и базы данных</w:t>
+      </w:r>
+      <w:r>
+        <w:rPr>
+          <w:szCs w:val="28"/>
+          <w:u w:val="single"/>
+        </w:rPr>
+        <w:t>              </w:t>
+      </w:r>
     </w:p>
     <w:p>
       <w:pPr>
         <w:rPr>
-          <w:lang w:val="ru-RU"/>
-        </w:rPr>
-      </w:pPr>
+          <w:szCs w:val="24"/>
+          <w:vertAlign w:val="superscript"/>
+          <w:lang w:val="ru-RU"/>
+        </w:rPr>
+      </w:pPr>
+      <w:r>
+        <w:rPr>
+          <w:vertAlign w:val="superscript"/>
+          <w:lang w:val="ru-RU"/>
+        </w:rPr>
+        <w:t xml:space="preserve">                                                                                                                                                             (наименование)</w:t>
+      </w:r>
     </w:p>
     <w:p>
       <w:pPr>
-        <w:jc w:val="center"/>
-        <w:rPr>
-          <w:lang w:val="ru-RU"/>
-        </w:rPr>
-      </w:pPr>
-      <w:proofErr w:type="spellStart"/>
-      <w:r>
-        <w:lastRenderedPageBreak/>
-        <w:t>Москва</w:t>
-      </w:r>
-      <w:proofErr w:type="spellEnd"/>
-      <w:r>
-        <w:t xml:space="preserve"> – 202</w:t>
-      </w:r>
-      <w:r>
-        <w:rPr>
-          <w:lang w:val="ru-RU"/>
-        </w:rPr>
-        <w:t>6</w:t>
-      </w:r>
-    </w:p>
-    <w:p/>
-    <w:p/>
-    <w:p>
-      <w:pPr>
-        <w:spacing w:after="200" w:line="276" w:lineRule="auto"/>
-        <w:rPr>
-          <w:b/>
-          <w:lang w:val="ru-RU"/>
-        </w:rPr>
-      </w:pPr>
-      <w:r>
-        <w:rPr>
-          <w:b/>
-          <w:lang w:val="ru-RU"/>
-        </w:rPr>
-        <w:br w:type="page"/>
-      </w:r>
+        <w:rPr>
+          <w:szCs w:val="28"/>
+          <w:lang w:val="ru-RU"/>
+        </w:rPr>
+      </w:pPr>
     </w:p>
     <w:p>
       <w:pPr>
-        <w:pStyle w:val="Heading1"/>
-        <w:rPr>
-          <w:lang w:val="ru-RU"/>
-        </w:rPr>
-      </w:pPr>
-      <w:r>
-        <w:rPr>
-          <w:lang w:val="ru-RU"/>
-        </w:rPr>
-        <w:lastRenderedPageBreak/>
-        <w:t>Теория</w:t>
-      </w:r>
+        <w:autoSpaceDE w:val="0"/>
+        <w:autoSpaceDN w:val="0"/>
+        <w:adjustRightInd w:val="0"/>
+        <w:rPr>
+          <w:szCs w:val="28"/>
+          <w:lang w:val="ru-RU" w:bidi="pa-IN"/>
+        </w:rPr>
+      </w:pPr>
     </w:p>
     <w:p>
       <w:pPr>
+        <w:autoSpaceDE w:val="0"/>
+        <w:autoSpaceDN w:val="0"/>
+        <w:adjustRightInd w:val="0"/>
+        <w:rPr>
+          <w:szCs w:val="32"/>
+          <w:lang w:val="ru-RU" w:bidi="pa-IN"/>
+        </w:rPr>
+      </w:pPr>
+      <w:r>
+        <w:rPr>
+          <w:szCs w:val="28"/>
+          <w:lang w:val="ru-RU" w:bidi="pa-IN"/>
+        </w:rPr>
+        <w:t xml:space="preserve">Группа </w:t>
+      </w:r>
+      <w:r>
+        <w:rPr>
+          <w:szCs w:val="32"/>
+          <w:lang w:val="ru-RU" w:bidi="pa-IN"/>
+        </w:rPr>
+        <w:t>23ИТ-МО(б/о)ИСБД-1</w:t>
+      </w:r>
+    </w:p>
+    <w:p>
+      <w:pPr>
+        <w:spacing w:before="120"/>
+        <w:rPr>
+          <w:color w:val="4BACC6" w:themeColor="accent5"/>
+          <w:sz w:val="24"/>
+          <w:szCs w:val="28"/>
+          <w:lang w:val="ru-RU"/>
+        </w:rPr>
+      </w:pPr>
+      <w:r>
+        <w:rPr>
+          <w:szCs w:val="28"/>
+          <w:lang w:val="ru-RU"/>
+        </w:rPr>
+        <w:t xml:space="preserve">Студент </w:t>
+      </w:r>
+      <w:r>
+        <w:rPr>
+          <w:szCs w:val="28"/>
+          <w:lang w:val="ru-RU"/>
+        </w:rPr>
+        <w:tab/>
+      </w:r>
+      <w:r>
+        <w:rPr>
+          <w:szCs w:val="28"/>
+          <w:lang w:val="ru-RU"/>
+        </w:rPr>
+        <w:tab/>
+      </w:r>
+      <w:r>
+        <w:rPr>
+          <w:szCs w:val="28"/>
+          <w:lang w:val="ru-RU"/>
+        </w:rPr>
+        <w:tab/>
+      </w:r>
+      <w:r>
+        <w:rPr>
+          <w:szCs w:val="28"/>
+          <w:lang w:val="ru-RU"/>
+        </w:rPr>
+        <w:tab/>
+      </w:r>
+      <w:r>
+        <w:rPr>
+          <w:szCs w:val="28"/>
+          <w:lang w:val="ru-RU"/>
+        </w:rPr>
+        <w:tab/>
+        <w:t xml:space="preserve">_________      _________ </w:t>
+      </w:r>
+      <w:r>
+        <w:rPr>
+          <w:szCs w:val="28"/>
+          <w:lang w:val="ru-RU"/>
+        </w:rPr>
+        <w:tab/>
+        <w:t xml:space="preserve">        </w:t>
+      </w:r>
+      <w:r>
+        <w:rPr>
+          <w:color w:val="4BACC6" w:themeColor="accent5"/>
+          <w:szCs w:val="28"/>
+          <w:lang w:val="ru-RU"/>
+        </w:rPr>
+        <w:t>Т.А.</w:t>
+      </w:r>
+      <w:r>
+        <w:rPr>
+          <w:color w:val="4BACC6" w:themeColor="accent5"/>
+          <w:szCs w:val="28"/>
+          <w:lang w:val="ru-RU"/>
+        </w:rPr>
+        <w:t xml:space="preserve"> </w:t>
+      </w:r>
+      <w:r>
+        <w:rPr>
+          <w:color w:val="4BACC6" w:themeColor="accent5"/>
+          <w:szCs w:val="28"/>
+          <w:lang w:val="ru-RU"/>
+        </w:rPr>
+        <w:t>Шигабутдинов</w:t>
+      </w:r>
+    </w:p>
+    <w:p>
+      <w:pPr>
+        <w:tabs>
+          <w:tab w:val="left" w:pos="6663"/>
+        </w:tabs>
+        <w:rPr>
+          <w:sz w:val="20"/>
+          <w:szCs w:val="24"/>
+          <w:lang w:val="ru-RU"/>
+        </w:rPr>
+      </w:pPr>
+      <w:r>
+        <w:rPr>
+          <w:sz w:val="20"/>
+          <w:lang w:val="ru-RU"/>
+        </w:rPr>
+        <w:t xml:space="preserve">                                                                                         (подпись)               </w:t>
+      </w:r>
+      <w:r>
+        <w:rPr>
+          <w:sz w:val="20"/>
+          <w:lang w:val="ru-RU"/>
+        </w:rPr>
+        <w:t>05.06.2026</w:t>
+      </w:r>
+    </w:p>
+    <w:p>
+      <w:pPr>
+        <w:autoSpaceDE w:val="0"/>
+        <w:autoSpaceDN w:val="0"/>
+        <w:adjustRightInd w:val="0"/>
+        <w:rPr>
+          <w:sz w:val="24"/>
+          <w:szCs w:val="28"/>
+          <w:lang w:val="ru-RU" w:bidi="pa-IN"/>
+        </w:rPr>
+      </w:pPr>
+    </w:p>
+    <w:p>
+      <w:pPr>
+        <w:rPr>
+          <w:b/>
+          <w:szCs w:val="24"/>
+          <w:lang w:val="ru-RU"/>
+        </w:rPr>
+      </w:pPr>
+    </w:p>
+    <w:p>
+      <w:pPr>
+        <w:rPr>
+          <w:szCs w:val="28"/>
+          <w:lang w:val="ru-RU"/>
+        </w:rPr>
+      </w:pPr>
+    </w:p>
+    <w:p>
+      <w:pPr>
+        <w:rPr>
+          <w:b/>
+          <w:szCs w:val="24"/>
+          <w:lang w:val="ru-RU"/>
+        </w:rPr>
+      </w:pPr>
+      <w:r>
+        <w:rPr>
+          <w:szCs w:val="23"/>
+          <w:lang w:val="ru-RU"/>
+        </w:rPr>
+        <w:t xml:space="preserve">Объем заимствованного текста не превышает 20 %. </w:t>
+      </w:r>
+    </w:p>
+    <w:p>
+      <w:pPr>
+        <w:spacing w:before="120"/>
+        <w:rPr>
+          <w:lang w:val="ru-RU"/>
+        </w:rPr>
+      </w:pPr>
+    </w:p>
+    <w:p>
+      <w:pPr>
+        <w:spacing w:before="120"/>
+        <w:rPr>
+          <w:lang w:val="ru-RU"/>
+        </w:rPr>
+      </w:pPr>
+      <w:r>
+        <w:rPr>
+          <w:lang w:val="ru-RU"/>
+        </w:rPr>
+        <w:t xml:space="preserve">Допустить к защите    </w:t>
+      </w:r>
+      <w:r>
+        <w:rPr>
+          <w:szCs w:val="28"/>
+          <w:lang w:val="ru-RU"/>
+        </w:rPr>
+        <w:t xml:space="preserve">_________   </w:t>
+      </w:r>
+      <w:r>
+        <w:rPr>
+          <w:color w:val="4BACC6" w:themeColor="accent5"/>
+          <w:szCs w:val="28"/>
+          <w:lang w:val="ru-RU"/>
+        </w:rPr>
+        <w:t>И.О. Фамилия руководителя</w:t>
+      </w:r>
+    </w:p>
+    <w:p>
+      <w:pPr>
+        <w:tabs>
+          <w:tab w:val="left" w:pos="6663"/>
+        </w:tabs>
+        <w:rPr>
+          <w:sz w:val="20"/>
+          <w:lang w:val="ru-RU"/>
+        </w:rPr>
+      </w:pPr>
+      <w:r>
+        <w:rPr>
+          <w:sz w:val="20"/>
+          <w:lang w:val="ru-RU"/>
+        </w:rPr>
+        <w:t xml:space="preserve">                                                         (подпись)</w:t>
+      </w:r>
+    </w:p>
+    <w:p>
+      <w:pPr>
+        <w:spacing w:before="120"/>
+        <w:rPr>
+          <w:lang w:val="ru-RU"/>
+        </w:rPr>
+      </w:pPr>
+      <w:r>
+        <w:rPr>
+          <w:lang w:val="ru-RU"/>
+        </w:rPr>
+        <w:t xml:space="preserve">Руководитель </w:t>
+      </w:r>
+    </w:p>
+    <w:p>
+      <w:pPr>
+        <w:spacing w:before="120"/>
+        <w:rPr>
+          <w:color w:val="4BACC6" w:themeColor="accent5"/>
+          <w:lang w:val="ru-RU"/>
+        </w:rPr>
+      </w:pPr>
+      <w:r>
+        <w:rPr>
+          <w:lang w:val="ru-RU"/>
+        </w:rPr>
+        <w:t xml:space="preserve">курсовой работы                                                       </w:t>
+      </w:r>
+      <w:r>
+        <w:rPr>
+          <w:lang w:val="ru-RU"/>
+        </w:rPr>
+        <w:t>И.С. Колотовкин</w:t>
+      </w:r>
+    </w:p>
+    <w:p>
+      <w:pPr>
+        <w:tabs>
+          <w:tab w:val="left" w:pos="6663"/>
+        </w:tabs>
+        <w:rPr>
+          <w:sz w:val="20"/>
+          <w:lang w:val="ru-RU"/>
+        </w:rPr>
+      </w:pPr>
+      <w:r>
+        <w:rPr>
+          <w:sz w:val="20"/>
+          <w:lang w:val="ru-RU"/>
+        </w:rPr>
+        <w:t xml:space="preserve">                                                                                                              (подпись)            </w:t>
+      </w:r>
+      <w:r>
+        <w:rPr>
+          <w:sz w:val="20"/>
+          <w:lang w:val="ru-RU"/>
+        </w:rPr>
+        <w:t>05.06.2026</w:t>
+      </w:r>
+    </w:p>
+    <w:p>
+      <w:pPr>
+        <w:autoSpaceDE w:val="0"/>
+        <w:autoSpaceDN w:val="0"/>
+        <w:adjustRightInd w:val="0"/>
+        <w:rPr>
+          <w:sz w:val="24"/>
+          <w:szCs w:val="28"/>
+          <w:lang w:val="ru-RU" w:bidi="pa-IN"/>
+        </w:rPr>
+      </w:pPr>
+    </w:p>
+    <w:p>
+      <w:pPr>
+        <w:spacing w:before="120"/>
+        <w:rPr>
+          <w:szCs w:val="24"/>
+          <w:lang w:val="ru-RU"/>
+        </w:rPr>
+      </w:pPr>
+    </w:p>
+    <w:p>
+      <w:pPr>
+        <w:jc w:val="center"/>
+        <w:rPr>
+          <w:lang w:val="ru-RU"/>
+        </w:rPr>
+      </w:pPr>
+    </w:p>
+    <w:p>
+      <w:pPr>
+        <w:rPr>
+          <w:lang w:val="ru-RU"/>
+        </w:rPr>
+      </w:pPr>
+    </w:p>
+    <w:p>
+      <w:pPr>
+        <w:jc w:val="center"/>
+        <w:rPr>
+          <w:szCs w:val="28"/>
+          <w:lang w:val="ru-RU"/>
+        </w:rPr>
+      </w:pPr>
+    </w:p>
+    <w:p>
+      <w:pPr>
+        <w:jc w:val="center"/>
+        <w:rPr>
+          <w:szCs w:val="28"/>
+          <w:lang w:val="ru-RU"/>
+        </w:rPr>
+      </w:pPr>
+      <w:r>
+        <w:rPr>
+          <w:szCs w:val="28"/>
+          <w:lang w:val="ru-RU"/>
+        </w:rPr>
+        <w:t>Москва, 2026</w:t>
+      </w:r>
+    </w:p>
+    <w:p>
+      <w:pPr>
+        <w:spacing w:after="160" w:line="256" w:lineRule="auto"/>
+        <w:rPr>
+          <w:szCs w:val="28"/>
+          <w:lang w:val="ru-RU"/>
+        </w:rPr>
+      </w:pPr>
+      <w:r>
+        <w:rPr>
+          <w:szCs w:val="28"/>
+          <w:lang w:val="ru-RU"/>
+        </w:rPr>
+        <w:br w:type="page"/>
+      </w:r>
+      <w:bookmarkStart w:id="0" w:name="_GoBack"/>
+      <w:bookmarkEnd w:id="0"/>
+    </w:p>
+    <w:p>
+      <w:pPr>
+        <w:jc w:val="center"/>
+        <w:rPr>
+          <w:lang w:val="ru-RU"/>
+        </w:rPr>
+      </w:pPr>
+    </w:p>
+    <w:p>
+      <w:pPr>
+        <w:pStyle w:val="Heading1"/>
+        <w:rPr>
+          <w:lang w:val="ru-RU"/>
+        </w:rPr>
+      </w:pPr>
+      <w:r>
+        <w:rPr>
+          <w:lang w:val="ru-RU"/>
+        </w:rPr>
+        <w:t>Теория</w:t>
+      </w:r>
+    </w:p>
+    <w:p>
+      <w:pPr>
         <w:jc w:val="center"/>
         <w:rPr>
           <w:lang w:val="ru-RU"/>
@@ -4168,8 +4702,6 @@
         </w:rPr>
         <w:t>, а связывает курс дискретной математики с современным инструментом хранения данных. Перспектива развития — алгоритмические запросы и, при необходимости, веб-доступ — естественно вытекает из заложенной архитектуры.</w:t>
       </w:r>
-      <w:bookmarkStart w:id="0" w:name="_GoBack"/>
-      <w:bookmarkEnd w:id="0"/>
     </w:p>
     <w:sectPr>
       <w:pgSz w:w="12240" w:h="15840"/>
@@ -15761,6 +16293,23 @@
       </w:tcPr>
     </w:tblStylePr>
   </w:style>
+  <w:style w:type="paragraph" w:customStyle="1" w:styleId="Default">
+    <w:name w:val="Default"/>
+    <w:rsid w:val="00F26A9B"/>
+    <w:pPr>
+      <w:autoSpaceDE w:val="0"/>
+      <w:autoSpaceDN w:val="0"/>
+      <w:adjustRightInd w:val="0"/>
+      <w:spacing w:after="0" w:line="240" w:lineRule="auto"/>
+    </w:pPr>
+    <w:rPr>
+      <w:rFonts w:ascii="Times New Roman" w:eastAsia="Times New Roman" w:hAnsi="Times New Roman" w:cs="Times New Roman"/>
+      <w:color w:val="000000"/>
+      <w:sz w:val="24"/>
+      <w:szCs w:val="24"/>
+      <w:lang w:val="ru-RU" w:eastAsia="ru-RU" w:bidi="pa-IN"/>
+    </w:rPr>
+  </w:style>
 </w:styles>
 </file>
 
@@ -16089,7 +16638,7 @@
 </file>
 
 <file path=customXml/itemProps1.xml><?xml version="1.0" encoding="utf-8"?>
-<ds:datastoreItem xmlns:ds="http://schemas.openxmlformats.org/officeDocument/2006/customXml" ds:itemID="{8C66EA72-A8F1-4F91-A6DF-B3AB17DBAB5B}">
+<ds:datastoreItem xmlns:ds="http://schemas.openxmlformats.org/officeDocument/2006/customXml" ds:itemID="{13ED1747-9E2F-4A24-9DE9-FF88BC60D213}">
   <ds:schemaRefs>
     <ds:schemaRef ds:uri="http://schemas.openxmlformats.org/officeDocument/2006/bibliography"/>
   </ds:schemaRefs>

</xml_diff>